<commit_message>
md2docx v0.0.3: title page + multilevel heading numbering for gost profile
- New include_title_page/subtitle parameters, wired to Pandoc's native
  title-block metadata (--metadata title=/subtitle=) rather than markdown
  syntax - renders via the reference-doc's built-in Title/Subtitle styles.
- reference_gost.docx: added multilevel numbering (Heading 1 = "1.",
  Heading 2 = "1.1.", Heading 3 = "1.1.1.") linked at the style level via
  numbering.xml + styles.xml numPr, so Pandoc-generated headings inherit
  it automatically with no per-paragraph markup. Confirmed against a real
  reference document that this is how GOST-style policies expect it.
- Restyled the default Title/Subtitle styles to GOST-consistent Times New
  Roman instead of Word's decorative defaults.

Verified end-to-end locally via pandoc CLI: title page + TOC + numbering
+ footnotes all render correctly together.
</commit_message>
<xml_diff>
--- a/tools/md2docx/multi-templates/reference_gost.docx
+++ b/tools/md2docx/multi-templates/reference_gost.docx
@@ -240,6 +240,41 @@
   </w:num>
   <w:num w:numId="9">
     <w:abstractNumId w:val="0"/>
+  </w:num>
+  <w:abstractNum w:abstractNumId="100">
+    <w:nsid w:val="10000001"/>
+    <w:multiLevelType w:val="multilevel"/>
+    <w:tmpl w:val="10000001"/>
+    <w:lvl w:ilvl="0">
+      <w:start w:val="1"/>
+      <w:numFmt w:val="decimal"/>
+      <w:lvlText w:val="%1."/>
+      <w:lvlJc w:val="left"/>
+      <w:pPr>
+        <w:ind w:left="432" w:hanging="432"/>
+      </w:pPr>
+    </w:lvl>
+    <w:lvl w:ilvl="1">
+      <w:start w:val="1"/>
+      <w:numFmt w:val="decimal"/>
+      <w:lvlText w:val="%1.%2."/>
+      <w:lvlJc w:val="left"/>
+      <w:pPr>
+        <w:ind w:left="576" w:hanging="576"/>
+      </w:pPr>
+    </w:lvl>
+    <w:lvl w:ilvl="2">
+      <w:start w:val="1"/>
+      <w:numFmt w:val="decimal"/>
+      <w:lvlText w:val="%1.%2.%3."/>
+      <w:lvlJc w:val="left"/>
+      <w:pPr>
+        <w:ind w:left="720" w:hanging="720"/>
+      </w:pPr>
+    </w:lvl>
+  </w:abstractNum>
+  <w:num w:numId="100">
+    <w:abstractNumId w:val="100"/>
   </w:num>
 </w:numbering>
 </file>
@@ -466,6 +501,10 @@
     <w:qFormat/>
     <w:rsid w:val="00FC693F"/>
     <w:pPr>
+      <w:numPr>
+        <w:ilvl w:val="0"/>
+        <w:numId w:val="100"/>
+      </w:numPr>
       <w:keepNext/>
       <w:keepLines/>
       <w:spacing w:before="480" w:after="0"/>
@@ -490,6 +529,10 @@
     <w:qFormat/>
     <w:rsid w:val="00FC693F"/>
     <w:pPr>
+      <w:numPr>
+        <w:ilvl w:val="1"/>
+        <w:numId w:val="100"/>
+      </w:numPr>
       <w:keepNext/>
       <w:keepLines/>
       <w:spacing w:before="200" w:after="0"/>
@@ -514,6 +557,10 @@
     <w:qFormat/>
     <w:rsid w:val="00FC693F"/>
     <w:pPr>
+      <w:numPr>
+        <w:ilvl w:val="2"/>
+        <w:numId w:val="100"/>
+      </w:numPr>
       <w:keepNext/>
       <w:keepLines/>
       <w:spacing w:before="200" w:after="0"/>
@@ -759,14 +806,17 @@
         <w:bottom w:val="single" w:sz="8" w:space="4" w:color="4F81BD" w:themeColor="accent1"/>
       </w:pBdr>
       <w:spacing w:after="300" w:line="240" w:lineRule="auto"/>
+      <w:ind w:firstLine="0"/>
       <w:contextualSpacing/>
+      <w:jc w:val="center"/>
     </w:pPr>
     <w:rPr>
-      <w:rFonts w:asciiTheme="majorHAnsi" w:eastAsiaTheme="majorEastAsia" w:hAnsiTheme="majorHAnsi" w:cstheme="majorBidi"/>
-      <w:color w:val="17365D" w:themeColor="text2" w:themeShade="BF"/>
+      <w:rFonts w:asciiTheme="majorHAnsi" w:eastAsiaTheme="majorEastAsia" w:hAnsiTheme="majorHAnsi" w:cstheme="majorBidi" w:ascii="Times New Roman" w:hAnsi="Times New Roman" w:eastAsia="Times New Roman" w:cs="Times New Roman"/>
+      <w:b/>
+      <w:color w:val="000000"/>
       <w:spacing w:val="5"/>
       <w:kern w:val="28"/>
-      <w:sz w:val="52"/>
+      <w:sz w:val="40"/>
       <w:szCs w:val="52"/>
     </w:rPr>
   </w:style>
@@ -797,14 +847,16 @@
       <w:numPr>
         <w:ilvl w:val="1"/>
       </w:numPr>
+      <w:ind w:firstLine="0"/>
+      <w:jc w:val="center"/>
     </w:pPr>
     <w:rPr>
-      <w:rFonts w:asciiTheme="majorHAnsi" w:eastAsiaTheme="majorEastAsia" w:hAnsiTheme="majorHAnsi" w:cstheme="majorBidi"/>
+      <w:rFonts w:asciiTheme="majorHAnsi" w:eastAsiaTheme="majorEastAsia" w:hAnsiTheme="majorHAnsi" w:cstheme="majorBidi" w:ascii="Times New Roman" w:hAnsi="Times New Roman" w:eastAsia="Times New Roman" w:cs="Times New Roman"/>
       <w:i/>
       <w:iCs/>
-      <w:color w:val="4F81BD" w:themeColor="accent1"/>
+      <w:color w:val="000000"/>
       <w:spacing w:val="15"/>
-      <w:sz w:val="24"/>
+      <w:sz w:val="28"/>
       <w:szCs w:val="24"/>
     </w:rPr>
   </w:style>

</xml_diff>